<commit_message>
:recycle: refactor: Adicionando o processo de testes a documentação
</commit_message>
<xml_diff>
--- a/Documents/Documents/Sprint_07_Task_86_DesenvolverApiAllergy.docx
+++ b/Documents/Documents/Sprint_07_Task_86_DesenvolverApiAllergy.docx
@@ -1007,6 +1007,12 @@
         </w:drawing>
       </w:r>
       <w:r>
+        <w:br/>
+      </w:r>
+      <w:r>
+        <w:br/>
+      </w:r>
+      <w:r>
         <w:t>Objetivo</w:t>
       </w:r>
     </w:p>
@@ -1015,7 +1021,11 @@
         <w:ind w:firstLine="708"/>
       </w:pPr>
       <w:r>
-        <w:t>Desenvolver a API da entidade Allergy dentro do sistema ERP SeniorCareManager, implementando operações CRUD e validações essenciais para garantir a integridade dos dados. A task segue o padrão arquitetural do projeto, com uso de DTOs, Services, Repositórios e Controllers desacoplados. Também deve ser realizado o desenvolvimento do Enum AllergyType.</w:t>
+        <w:t xml:space="preserve">Desenvolver a API da entidade Allergy dentro do sistema ERP SeniorCareManager, implementando operações CRUD e validações essenciais para garantir a integridade dos dados. A task segue o padrão </w:t>
+      </w:r>
+      <w:r>
+        <w:lastRenderedPageBreak/>
+        <w:t>arquitetural do projeto, com uso de DTOs, Services, Repositórios e Controllers desacoplados. Também deve ser realizado o desenvolvimento do Enum AllergyType.</w:t>
       </w:r>
     </w:p>
     <w:p/>
@@ -1167,21 +1177,46 @@
         <w:t>No serviço, foi implementada uma regra de negócio mais elaborada: o método CheckDuplicates() é responsável por verificar se já existe uma alergia cadastrada com o mesmo nome no banco de dados. Isso evita duplicidades e garante que os registros de alergias sejam únicos, mantendo a consistência das informações e evitando ambiguidade no sistema.</w:t>
       </w:r>
     </w:p>
-    <w:p/>
     <w:p>
-      <w:r>
-        <w:t>Além disso, as operações GetById() e Remove() no serviço realizam uma validação para garantir que o ID informado realmente corresponda a um registro existente. Caso contrário, uma exceção é lançada, informando que o recurso não foi encontrado. Essa verificação é parte essencial das regras de negócio, pois impede ações sobre dados inexistentes e melhora a robustez do sistema.</w:t>
-      </w:r>
-    </w:p>
-    <w:p/>
-    <w:p>
-      <w:r>
-        <w:t>Por fim, todo o tratamento de exceções é feito na camada de Controller, utilizando blocos try/catch para capturar exceções esperadas, como ArgumentException, InvalidOperationException e KeyNotFoundException. Esses erros são tratados de forma padronizada por meio de objetos da classe Response, que encapsula o código da resposta (ResponseEnum), uma mensagem explicativa e os dados relacionados. Essa abordagem oferece uma estrutura de resposta consistente e facilita o consumo da API por parte de clientes externos.</w:t>
-      </w:r>
+      <w:pPr>
+        <w:rPr>
+          <w:noProof/>
+        </w:rPr>
+      </w:pPr>
       <w:r>
         <w:br/>
       </w:r>
       <w:r>
+        <w:br/>
+      </w:r>
+      <w:r>
+        <w:br/>
+      </w:r>
+      <w:r>
+        <w:lastRenderedPageBreak/>
+        <w:br/>
+      </w:r>
+      <w:r>
+        <w:br/>
+      </w:r>
+      <w:r>
+        <w:br/>
+        <w:t>Testes realizados:</w:t>
+      </w:r>
+      <w:r>
+        <w:br/>
+      </w:r>
+      <w:r>
+        <w:rPr>
+          <w:noProof/>
+        </w:rPr>
+        <w:br/>
+        <w:t>Método GetAll</w:t>
+      </w:r>
+      <w:r>
+        <w:rPr>
+          <w:noProof/>
+        </w:rPr>
         <w:br/>
       </w:r>
       <w:r>
@@ -1189,10 +1224,10 @@
           <w:noProof/>
         </w:rPr>
         <w:drawing>
-          <wp:inline distT="0" distB="0" distL="0" distR="0" wp14:anchorId="01092BC5" wp14:editId="6609A3F9">
-            <wp:extent cx="3696216" cy="2267266"/>
-            <wp:effectExtent l="0" t="0" r="0" b="0"/>
-            <wp:docPr id="718901422" name="Picture 1" descr="A screenshot of a computer error&#10;&#10;AI-generated content may be incorrect."/>
+          <wp:inline distT="0" distB="0" distL="0" distR="0" wp14:anchorId="6BED743D" wp14:editId="32B249B9">
+            <wp:extent cx="6472555" cy="3236595"/>
+            <wp:effectExtent l="0" t="0" r="4445" b="1905"/>
+            <wp:docPr id="1627506014" name="Picture 1" descr="A screenshot of a computer&#10;&#10;AI-generated content may be incorrect."/>
             <wp:cNvGraphicFramePr>
               <a:graphicFrameLocks xmlns:a="http://schemas.openxmlformats.org/drawingml/2006/main" noChangeAspect="1"/>
             </wp:cNvGraphicFramePr>
@@ -1200,7 +1235,7 @@
               <a:graphicData uri="http://schemas.openxmlformats.org/drawingml/2006/picture">
                 <pic:pic xmlns:pic="http://schemas.openxmlformats.org/drawingml/2006/picture">
                   <pic:nvPicPr>
-                    <pic:cNvPr id="718901422" name="Picture 1" descr="A screenshot of a computer error&#10;&#10;AI-generated content may be incorrect."/>
+                    <pic:cNvPr id="1627506014" name="Picture 1" descr="A screenshot of a computer&#10;&#10;AI-generated content may be incorrect."/>
                     <pic:cNvPicPr/>
                   </pic:nvPicPr>
                   <pic:blipFill>
@@ -1212,7 +1247,263 @@
                   <pic:spPr>
                     <a:xfrm>
                       <a:off x="0" y="0"/>
-                      <a:ext cx="3696216" cy="2267266"/>
+                      <a:ext cx="6472555" cy="3236595"/>
+                    </a:xfrm>
+                    <a:prstGeom prst="rect">
+                      <a:avLst/>
+                    </a:prstGeom>
+                  </pic:spPr>
+                </pic:pic>
+              </a:graphicData>
+            </a:graphic>
+          </wp:inline>
+        </w:drawing>
+      </w:r>
+      <w:r>
+        <w:rPr>
+          <w:noProof/>
+        </w:rPr>
+        <w:br/>
+      </w:r>
+      <w:r>
+        <w:rPr>
+          <w:noProof/>
+        </w:rPr>
+        <w:br/>
+        <w:t>Método Post</w:t>
+      </w:r>
+      <w:r>
+        <w:rPr>
+          <w:noProof/>
+        </w:rPr>
+        <w:br/>
+      </w:r>
+      <w:r>
+        <w:rPr>
+          <w:noProof/>
+        </w:rPr>
+        <w:drawing>
+          <wp:inline distT="0" distB="0" distL="0" distR="0" wp14:anchorId="4028AE0E" wp14:editId="0865B8FB">
+            <wp:extent cx="6472555" cy="2058035"/>
+            <wp:effectExtent l="0" t="0" r="4445" b="0"/>
+            <wp:docPr id="2031492483" name="Picture 1" descr="A screenshot of a computer&#10;&#10;AI-generated content may be incorrect."/>
+            <wp:cNvGraphicFramePr>
+              <a:graphicFrameLocks xmlns:a="http://schemas.openxmlformats.org/drawingml/2006/main" noChangeAspect="1"/>
+            </wp:cNvGraphicFramePr>
+            <a:graphic xmlns:a="http://schemas.openxmlformats.org/drawingml/2006/main">
+              <a:graphicData uri="http://schemas.openxmlformats.org/drawingml/2006/picture">
+                <pic:pic xmlns:pic="http://schemas.openxmlformats.org/drawingml/2006/picture">
+                  <pic:nvPicPr>
+                    <pic:cNvPr id="2031492483" name="Picture 1" descr="A screenshot of a computer&#10;&#10;AI-generated content may be incorrect."/>
+                    <pic:cNvPicPr/>
+                  </pic:nvPicPr>
+                  <pic:blipFill>
+                    <a:blip r:embed="rId12"/>
+                    <a:stretch>
+                      <a:fillRect/>
+                    </a:stretch>
+                  </pic:blipFill>
+                  <pic:spPr>
+                    <a:xfrm>
+                      <a:off x="0" y="0"/>
+                      <a:ext cx="6472555" cy="2058035"/>
+                    </a:xfrm>
+                    <a:prstGeom prst="rect">
+                      <a:avLst/>
+                    </a:prstGeom>
+                  </pic:spPr>
+                </pic:pic>
+              </a:graphicData>
+            </a:graphic>
+          </wp:inline>
+        </w:drawing>
+      </w:r>
+      <w:r>
+        <w:rPr>
+          <w:noProof/>
+        </w:rPr>
+        <w:br/>
+      </w:r>
+      <w:r>
+        <w:rPr>
+          <w:noProof/>
+        </w:rPr>
+        <w:br/>
+        <w:t>Método GetById</w:t>
+      </w:r>
+      <w:r>
+        <w:rPr>
+          <w:noProof/>
+        </w:rPr>
+        <w:br/>
+      </w:r>
+      <w:r>
+        <w:rPr>
+          <w:noProof/>
+        </w:rPr>
+        <w:drawing>
+          <wp:inline distT="0" distB="0" distL="0" distR="0" wp14:anchorId="14B99865" wp14:editId="0BA068BE">
+            <wp:extent cx="6472555" cy="2143125"/>
+            <wp:effectExtent l="0" t="0" r="4445" b="9525"/>
+            <wp:docPr id="887165096" name="Picture 1" descr="A computer screen shot of a black screen&#10;&#10;AI-generated content may be incorrect."/>
+            <wp:cNvGraphicFramePr>
+              <a:graphicFrameLocks xmlns:a="http://schemas.openxmlformats.org/drawingml/2006/main" noChangeAspect="1"/>
+            </wp:cNvGraphicFramePr>
+            <a:graphic xmlns:a="http://schemas.openxmlformats.org/drawingml/2006/main">
+              <a:graphicData uri="http://schemas.openxmlformats.org/drawingml/2006/picture">
+                <pic:pic xmlns:pic="http://schemas.openxmlformats.org/drawingml/2006/picture">
+                  <pic:nvPicPr>
+                    <pic:cNvPr id="887165096" name="Picture 1" descr="A computer screen shot of a black screen&#10;&#10;AI-generated content may be incorrect."/>
+                    <pic:cNvPicPr/>
+                  </pic:nvPicPr>
+                  <pic:blipFill>
+                    <a:blip r:embed="rId13"/>
+                    <a:stretch>
+                      <a:fillRect/>
+                    </a:stretch>
+                  </pic:blipFill>
+                  <pic:spPr>
+                    <a:xfrm>
+                      <a:off x="0" y="0"/>
+                      <a:ext cx="6472555" cy="2143125"/>
+                    </a:xfrm>
+                    <a:prstGeom prst="rect">
+                      <a:avLst/>
+                    </a:prstGeom>
+                  </pic:spPr>
+                </pic:pic>
+              </a:graphicData>
+            </a:graphic>
+          </wp:inline>
+        </w:drawing>
+      </w:r>
+      <w:r>
+        <w:rPr>
+          <w:noProof/>
+        </w:rPr>
+        <w:br/>
+      </w:r>
+      <w:r>
+        <w:rPr>
+          <w:noProof/>
+        </w:rPr>
+        <w:br/>
+      </w:r>
+      <w:r>
+        <w:rPr>
+          <w:noProof/>
+        </w:rPr>
+        <w:br/>
+      </w:r>
+      <w:r>
+        <w:rPr>
+          <w:noProof/>
+        </w:rPr>
+        <w:lastRenderedPageBreak/>
+        <w:br/>
+      </w:r>
+      <w:r>
+        <w:rPr>
+          <w:noProof/>
+        </w:rPr>
+        <w:br/>
+      </w:r>
+    </w:p>
+    <w:p>
+      <w:r>
+        <w:rPr>
+          <w:noProof/>
+        </w:rPr>
+        <w:t>Método  Put</w:t>
+      </w:r>
+      <w:r>
+        <w:rPr>
+          <w:noProof/>
+        </w:rPr>
+        <w:br/>
+      </w:r>
+      <w:r>
+        <w:rPr>
+          <w:noProof/>
+        </w:rPr>
+        <w:drawing>
+          <wp:inline distT="0" distB="0" distL="0" distR="0" wp14:anchorId="1855D8B1" wp14:editId="5489E204">
+            <wp:extent cx="6472555" cy="2137410"/>
+            <wp:effectExtent l="0" t="0" r="4445" b="0"/>
+            <wp:docPr id="1674770000" name="Picture 1" descr="A screenshot of a computer&#10;&#10;AI-generated content may be incorrect."/>
+            <wp:cNvGraphicFramePr>
+              <a:graphicFrameLocks xmlns:a="http://schemas.openxmlformats.org/drawingml/2006/main" noChangeAspect="1"/>
+            </wp:cNvGraphicFramePr>
+            <a:graphic xmlns:a="http://schemas.openxmlformats.org/drawingml/2006/main">
+              <a:graphicData uri="http://schemas.openxmlformats.org/drawingml/2006/picture">
+                <pic:pic xmlns:pic="http://schemas.openxmlformats.org/drawingml/2006/picture">
+                  <pic:nvPicPr>
+                    <pic:cNvPr id="1674770000" name="Picture 1" descr="A screenshot of a computer&#10;&#10;AI-generated content may be incorrect."/>
+                    <pic:cNvPicPr/>
+                  </pic:nvPicPr>
+                  <pic:blipFill>
+                    <a:blip r:embed="rId14"/>
+                    <a:stretch>
+                      <a:fillRect/>
+                    </a:stretch>
+                  </pic:blipFill>
+                  <pic:spPr>
+                    <a:xfrm>
+                      <a:off x="0" y="0"/>
+                      <a:ext cx="6472555" cy="2137410"/>
+                    </a:xfrm>
+                    <a:prstGeom prst="rect">
+                      <a:avLst/>
+                    </a:prstGeom>
+                  </pic:spPr>
+                </pic:pic>
+              </a:graphicData>
+            </a:graphic>
+          </wp:inline>
+        </w:drawing>
+      </w:r>
+      <w:r>
+        <w:rPr>
+          <w:noProof/>
+        </w:rPr>
+        <w:br/>
+      </w:r>
+      <w:r>
+        <w:br/>
+        <w:t>Método Delete</w:t>
+      </w:r>
+      <w:r>
+        <w:br/>
+      </w:r>
+      <w:r>
+        <w:rPr>
+          <w:noProof/>
+        </w:rPr>
+        <w:drawing>
+          <wp:inline distT="0" distB="0" distL="0" distR="0" wp14:anchorId="6A8716BB" wp14:editId="2E73AB4F">
+            <wp:extent cx="6472555" cy="2846705"/>
+            <wp:effectExtent l="0" t="0" r="4445" b="0"/>
+            <wp:docPr id="518568585" name="Picture 1" descr="A screenshot of a computer&#10;&#10;AI-generated content may be incorrect."/>
+            <wp:cNvGraphicFramePr>
+              <a:graphicFrameLocks xmlns:a="http://schemas.openxmlformats.org/drawingml/2006/main" noChangeAspect="1"/>
+            </wp:cNvGraphicFramePr>
+            <a:graphic xmlns:a="http://schemas.openxmlformats.org/drawingml/2006/main">
+              <a:graphicData uri="http://schemas.openxmlformats.org/drawingml/2006/picture">
+                <pic:pic xmlns:pic="http://schemas.openxmlformats.org/drawingml/2006/picture">
+                  <pic:nvPicPr>
+                    <pic:cNvPr id="518568585" name="Picture 1" descr="A screenshot of a computer&#10;&#10;AI-generated content may be incorrect."/>
+                    <pic:cNvPicPr/>
+                  </pic:nvPicPr>
+                  <pic:blipFill>
+                    <a:blip r:embed="rId15"/>
+                    <a:stretch>
+                      <a:fillRect/>
+                    </a:stretch>
+                  </pic:blipFill>
+                  <pic:spPr>
+                    <a:xfrm>
+                      <a:off x="0" y="0"/>
+                      <a:ext cx="6472555" cy="2846705"/>
                     </a:xfrm>
                     <a:prstGeom prst="rect">
                       <a:avLst/>
@@ -1923,6 +2214,7 @@
   <w:style w:type="character" w:default="1" w:styleId="DefaultParagraphFont">
     <w:name w:val="Default Paragraph Font"/>
     <w:uiPriority w:val="1"/>
+    <w:semiHidden/>
     <w:unhideWhenUsed/>
   </w:style>
   <w:style w:type="table" w:default="1" w:styleId="TableNormal">
@@ -2598,21 +2890,12 @@
 </file>
 
 <file path=customXml/item1.xml><?xml version="1.0" encoding="utf-8"?>
-<?mso-contentType ?>
-<FormTemplates xmlns="http://schemas.microsoft.com/sharepoint/v3/contenttype/forms">
-  <Display>DocumentLibraryForm</Display>
-  <Edit>DocumentLibraryForm</Edit>
-  <New>DocumentLibraryForm</New>
-</FormTemplates>
-</file>
-
-<file path=customXml/item2.xml><?xml version="1.0" encoding="utf-8"?>
 <p:properties xmlns:p="http://schemas.microsoft.com/office/2006/metadata/properties" xmlns:xsi="http://www.w3.org/2001/XMLSchema-instance" xmlns:pc="http://schemas.microsoft.com/office/infopath/2007/PartnerControls">
   <documentManagement/>
 </p:properties>
 </file>
 
-<file path=customXml/item3.xml><?xml version="1.0" encoding="utf-8"?>
+<file path=customXml/item2.xml><?xml version="1.0" encoding="utf-8"?>
 <ct:contentTypeSchema xmlns:ct="http://schemas.microsoft.com/office/2006/metadata/contentType" xmlns:ma="http://schemas.microsoft.com/office/2006/metadata/properties/metaAttributes" ct:_="" ma:_="" ma:contentTypeName="Documento" ma:contentTypeID="0x010100B37008164333CE47B7554A23BF4CE40A" ma:contentTypeVersion="0" ma:contentTypeDescription="Crie um novo documento." ma:contentTypeScope="" ma:versionID="1ac3350bdf74d0e717bf911788fb6e9e">
   <xsd:schema xmlns:xsd="http://www.w3.org/2001/XMLSchema" xmlns:xs="http://www.w3.org/2001/XMLSchema" xmlns:p="http://schemas.microsoft.com/office/2006/metadata/properties" targetNamespace="http://schemas.microsoft.com/office/2006/metadata/properties" ma:root="true" ma:fieldsID="e257547f92819c86ae4143fe76bb6c5b">
     <xsd:element name="properties">
@@ -2726,15 +3009,16 @@
 </ct:contentTypeSchema>
 </file>
 
-<file path=customXml/itemProps1.xml><?xml version="1.0" encoding="utf-8"?>
-<ds:datastoreItem xmlns:ds="http://schemas.openxmlformats.org/officeDocument/2006/customXml" ds:itemID="{0876BD9A-9CA5-48C2-BF8E-F2DECFB0FD38}">
-  <ds:schemaRefs>
-    <ds:schemaRef ds:uri="http://schemas.microsoft.com/sharepoint/v3/contenttype/forms"/>
-  </ds:schemaRefs>
-</ds:datastoreItem>
+<file path=customXml/item3.xml><?xml version="1.0" encoding="utf-8"?>
+<?mso-contentType ?>
+<FormTemplates xmlns="http://schemas.microsoft.com/sharepoint/v3/contenttype/forms">
+  <Display>DocumentLibraryForm</Display>
+  <Edit>DocumentLibraryForm</Edit>
+  <New>DocumentLibraryForm</New>
+</FormTemplates>
 </file>
 
-<file path=customXml/itemProps2.xml><?xml version="1.0" encoding="utf-8"?>
+<file path=customXml/itemProps1.xml><?xml version="1.0" encoding="utf-8"?>
 <ds:datastoreItem xmlns:ds="http://schemas.openxmlformats.org/officeDocument/2006/customXml" ds:itemID="{0028EFB7-3706-477C-BC22-76AF0C752638}">
   <ds:schemaRefs>
     <ds:schemaRef ds:uri="http://schemas.microsoft.com/office/2006/metadata/properties"/>
@@ -2743,7 +3027,7 @@
 </ds:datastoreItem>
 </file>
 
-<file path=customXml/itemProps3.xml><?xml version="1.0" encoding="utf-8"?>
+<file path=customXml/itemProps2.xml><?xml version="1.0" encoding="utf-8"?>
 <ds:datastoreItem xmlns:ds="http://schemas.openxmlformats.org/officeDocument/2006/customXml" ds:itemID="{EA1501F1-8D64-4161-ACF2-581550DAF0E9}">
   <ds:schemaRefs>
     <ds:schemaRef ds:uri="http://schemas.microsoft.com/office/2006/metadata/contentType"/>
@@ -2757,4 +3041,12 @@
     <ds:schemaRef ds:uri="http://schemas.microsoft.com/office/infopath/2007/PartnerControls"/>
   </ds:schemaRefs>
 </ds:datastoreItem>
+</file>
+
+<file path=customXml/itemProps3.xml><?xml version="1.0" encoding="utf-8"?>
+<ds:datastoreItem xmlns:ds="http://schemas.openxmlformats.org/officeDocument/2006/customXml" ds:itemID="{0876BD9A-9CA5-48C2-BF8E-F2DECFB0FD38}">
+  <ds:schemaRefs>
+    <ds:schemaRef ds:uri="http://schemas.microsoft.com/sharepoint/v3/contenttype/forms"/>
+  </ds:schemaRefs>
+</ds:datastoreItem>
 </file>
</xml_diff>

<commit_message>
:recycle: refactor: Alteração na documentação de Allergy
</commit_message>
<xml_diff>
--- a/Documents/Documents/Sprint_07_Task_86_DesenvolverApiAllergy.docx
+++ b/Documents/Documents/Sprint_07_Task_86_DesenvolverApiAllergy.docx
@@ -1154,48 +1154,6 @@
       <w:r>
         <w:t xml:space="preserve">    DELETE /api/v1/allergy/{id} → Remove alergia, se existir</w:t>
       </w:r>
-    </w:p>
-    <w:p>
-      <w:r>
-        <w:t>Cada método possui tratamento de erros com mensagens apropriadas e retorno estruturado utilizando a classe Response.</w:t>
-      </w:r>
-    </w:p>
-    <w:p>
-      <w:r>
-        <w:t>Durante o desenvolvimento da API de Allergy no projeto SeniorCareManager, foram implementadas diferentes camadas de validação, com o objetivo de garantir a integridade dos dados e a previsibilidade no comportamento da aplicação. Essas validações foram distribuídas estrategicamente entre DTOs, serviços e controladores, de acordo com suas respectivas responsabilidades.</w:t>
-      </w:r>
-    </w:p>
-    <w:p/>
-    <w:p>
-      <w:r>
-        <w:t>A primeira validação ocorre ainda no nível do DTO, por meio do método CheckName(). Essa verificação assegura que o campo Name da alergia tenha sido devidamente preenchido antes que qualquer operação de criação ou atualização seja realizada. Essa abordagem representa uma validação básica, mas fundamental para impedir o envio de dados nulos ou em branco.</w:t>
-      </w:r>
-    </w:p>
-    <w:p/>
-    <w:p>
-      <w:r>
-        <w:t>No serviço, foi implementada uma regra de negócio mais elaborada: o método CheckDuplicates() é responsável por verificar se já existe uma alergia cadastrada com o mesmo nome no banco de dados. Isso evita duplicidades e garante que os registros de alergias sejam únicos, mantendo a consistência das informações e evitando ambiguidade no sistema.</w:t>
-      </w:r>
-    </w:p>
-    <w:p>
-      <w:pPr>
-        <w:rPr>
-          <w:noProof/>
-        </w:rPr>
-      </w:pPr>
-      <w:r>
-        <w:br/>
-      </w:r>
-      <w:r>
-        <w:br/>
-      </w:r>
-      <w:r>
-        <w:br/>
-      </w:r>
-      <w:r>
-        <w:lastRenderedPageBreak/>
-        <w:br/>
-      </w:r>
       <w:r>
         <w:br/>
       </w:r>
@@ -1282,6 +1240,7 @@
         <w:rPr>
           <w:noProof/>
         </w:rPr>
+        <w:lastRenderedPageBreak/>
         <w:drawing>
           <wp:inline distT="0" distB="0" distL="0" distR="0" wp14:anchorId="4028AE0E" wp14:editId="0865B8FB">
             <wp:extent cx="6472555" cy="2058035"/>
@@ -1399,7 +1358,6 @@
         <w:rPr>
           <w:noProof/>
         </w:rPr>
-        <w:lastRenderedPageBreak/>
         <w:br/>
       </w:r>
       <w:r>
@@ -1470,6 +1428,9 @@
       </w:r>
       <w:r>
         <w:br/>
+      </w:r>
+      <w:r>
+        <w:lastRenderedPageBreak/>
         <w:t>Método Delete</w:t>
       </w:r>
       <w:r>
@@ -2890,12 +2851,6 @@
 </file>
 
 <file path=customXml/item1.xml><?xml version="1.0" encoding="utf-8"?>
-<p:properties xmlns:p="http://schemas.microsoft.com/office/2006/metadata/properties" xmlns:xsi="http://www.w3.org/2001/XMLSchema-instance" xmlns:pc="http://schemas.microsoft.com/office/infopath/2007/PartnerControls">
-  <documentManagement/>
-</p:properties>
-</file>
-
-<file path=customXml/item2.xml><?xml version="1.0" encoding="utf-8"?>
 <ct:contentTypeSchema xmlns:ct="http://schemas.microsoft.com/office/2006/metadata/contentType" xmlns:ma="http://schemas.microsoft.com/office/2006/metadata/properties/metaAttributes" ct:_="" ma:_="" ma:contentTypeName="Documento" ma:contentTypeID="0x010100B37008164333CE47B7554A23BF4CE40A" ma:contentTypeVersion="0" ma:contentTypeDescription="Crie um novo documento." ma:contentTypeScope="" ma:versionID="1ac3350bdf74d0e717bf911788fb6e9e">
   <xsd:schema xmlns:xsd="http://www.w3.org/2001/XMLSchema" xmlns:xs="http://www.w3.org/2001/XMLSchema" xmlns:p="http://schemas.microsoft.com/office/2006/metadata/properties" targetNamespace="http://schemas.microsoft.com/office/2006/metadata/properties" ma:root="true" ma:fieldsID="e257547f92819c86ae4143fe76bb6c5b">
     <xsd:element name="properties">
@@ -3009,6 +2964,12 @@
 </ct:contentTypeSchema>
 </file>
 
+<file path=customXml/item2.xml><?xml version="1.0" encoding="utf-8"?>
+<p:properties xmlns:p="http://schemas.microsoft.com/office/2006/metadata/properties" xmlns:xsi="http://www.w3.org/2001/XMLSchema-instance" xmlns:pc="http://schemas.microsoft.com/office/infopath/2007/PartnerControls">
+  <documentManagement/>
+</p:properties>
+</file>
+
 <file path=customXml/item3.xml><?xml version="1.0" encoding="utf-8"?>
 <?mso-contentType ?>
 <FormTemplates xmlns="http://schemas.microsoft.com/sharepoint/v3/contenttype/forms">
@@ -3019,15 +2980,6 @@
 </file>
 
 <file path=customXml/itemProps1.xml><?xml version="1.0" encoding="utf-8"?>
-<ds:datastoreItem xmlns:ds="http://schemas.openxmlformats.org/officeDocument/2006/customXml" ds:itemID="{0028EFB7-3706-477C-BC22-76AF0C752638}">
-  <ds:schemaRefs>
-    <ds:schemaRef ds:uri="http://schemas.microsoft.com/office/2006/metadata/properties"/>
-    <ds:schemaRef ds:uri="http://schemas.microsoft.com/office/infopath/2007/PartnerControls"/>
-  </ds:schemaRefs>
-</ds:datastoreItem>
-</file>
-
-<file path=customXml/itemProps2.xml><?xml version="1.0" encoding="utf-8"?>
 <ds:datastoreItem xmlns:ds="http://schemas.openxmlformats.org/officeDocument/2006/customXml" ds:itemID="{EA1501F1-8D64-4161-ACF2-581550DAF0E9}">
   <ds:schemaRefs>
     <ds:schemaRef ds:uri="http://schemas.microsoft.com/office/2006/metadata/contentType"/>
@@ -3043,6 +2995,15 @@
 </ds:datastoreItem>
 </file>
 
+<file path=customXml/itemProps2.xml><?xml version="1.0" encoding="utf-8"?>
+<ds:datastoreItem xmlns:ds="http://schemas.openxmlformats.org/officeDocument/2006/customXml" ds:itemID="{0028EFB7-3706-477C-BC22-76AF0C752638}">
+  <ds:schemaRefs>
+    <ds:schemaRef ds:uri="http://schemas.microsoft.com/office/2006/metadata/properties"/>
+    <ds:schemaRef ds:uri="http://schemas.microsoft.com/office/infopath/2007/PartnerControls"/>
+  </ds:schemaRefs>
+</ds:datastoreItem>
+</file>
+
 <file path=customXml/itemProps3.xml><?xml version="1.0" encoding="utf-8"?>
 <ds:datastoreItem xmlns:ds="http://schemas.openxmlformats.org/officeDocument/2006/customXml" ds:itemID="{0876BD9A-9CA5-48C2-BF8E-F2DECFB0FD38}">
   <ds:schemaRefs>

</xml_diff>

<commit_message>
:books: docs: Atualizando a documentação
</commit_message>
<xml_diff>
--- a/Documents/Documents/Sprint_07_Task_86_DesenvolverApiAllergy.docx
+++ b/Documents/Documents/Sprint_07_Task_86_DesenvolverApiAllergy.docx
@@ -334,58 +334,6 @@
           <w:p>
             <w:r>
               <w:rPr>
-                <w:spacing w:val="-4"/>
-              </w:rPr>
-              <w:t>Edson</w:t>
-            </w:r>
-            <w:r>
-              <w:rPr>
-                <w:spacing w:val="-19"/>
-              </w:rPr>
-              <w:t xml:space="preserve"> </w:t>
-            </w:r>
-            <w:r>
-              <w:rPr>
-                <w:spacing w:val="-4"/>
-              </w:rPr>
-              <w:t>Pereira</w:t>
-            </w:r>
-            <w:r>
-              <w:rPr>
-                <w:spacing w:val="-17"/>
-              </w:rPr>
-              <w:t xml:space="preserve"> </w:t>
-            </w:r>
-            <w:r>
-              <w:rPr>
-                <w:spacing w:val="-4"/>
-              </w:rPr>
-              <w:t>De</w:t>
-            </w:r>
-            <w:r>
-              <w:rPr>
-                <w:spacing w:val="-16"/>
-              </w:rPr>
-              <w:t xml:space="preserve"> </w:t>
-            </w:r>
-            <w:r>
-              <w:rPr>
-                <w:spacing w:val="-4"/>
-              </w:rPr>
-              <w:t>Carvalho</w:t>
-            </w:r>
-          </w:p>
-        </w:tc>
-      </w:tr>
-      <w:tr>
-        <w:tc>
-          <w:tcPr>
-            <w:tcW w:w="10201" w:type="dxa"/>
-            <w:gridSpan w:val="4"/>
-          </w:tcPr>
-          <w:p>
-            <w:r>
-              <w:rPr>
                 <w:spacing w:val="-16"/>
               </w:rPr>
               <w:t>Franciane Ramos Franco</w:t>
@@ -721,12 +669,12 @@
         <w:tblLook w:val="04A0" w:firstRow="1" w:lastRow="0" w:firstColumn="1" w:lastColumn="0" w:noHBand="0" w:noVBand="1"/>
       </w:tblPr>
       <w:tblGrid>
-        <w:gridCol w:w="818"/>
-        <w:gridCol w:w="2889"/>
-        <w:gridCol w:w="1618"/>
-        <w:gridCol w:w="1407"/>
-        <w:gridCol w:w="1808"/>
-        <w:gridCol w:w="1643"/>
+        <w:gridCol w:w="828"/>
+        <w:gridCol w:w="2971"/>
+        <w:gridCol w:w="1441"/>
+        <w:gridCol w:w="1418"/>
+        <w:gridCol w:w="1842"/>
+        <w:gridCol w:w="1683"/>
       </w:tblGrid>
       <w:tr>
         <w:tc>
@@ -842,7 +790,7 @@
           </w:tcPr>
           <w:p>
             <w:r>
-              <w:t>Marcoantonio-dev</w:t>
+              <w:t>Marco Masson</w:t>
             </w:r>
           </w:p>
         </w:tc>
@@ -1021,11 +969,7 @@
         <w:ind w:firstLine="708"/>
       </w:pPr>
       <w:r>
-        <w:t xml:space="preserve">Desenvolver a API da entidade Allergy dentro do sistema ERP SeniorCareManager, implementando operações CRUD e validações essenciais para garantir a integridade dos dados. A task segue o padrão </w:t>
-      </w:r>
-      <w:r>
-        <w:lastRenderedPageBreak/>
-        <w:t>arquitetural do projeto, com uso de DTOs, Services, Repositórios e Controllers desacoplados. Também deve ser realizado o desenvolvimento do Enum AllergyType.</w:t>
+        <w:t>Desenvolver a API da entidade Allergy dentro do sistema ERP SeniorCareManager, implementando operações CRUD e validações essenciais para garantir a integridade dos dados. A task segue o padrão arquitetural do projeto, com uso de DTOs, Services, Repositórios e Controllers desacoplados. Também deve ser realizado o desenvolvimento do Enum AllergyType.</w:t>
       </w:r>
     </w:p>
     <w:p/>
@@ -1475,6 +1419,11 @@
             </a:graphic>
           </wp:inline>
         </w:drawing>
+      </w:r>
+    </w:p>
+    <w:p>
+      <w:r>
+        <w:t>Testes repoduzidos e validados.</w:t>
       </w:r>
     </w:p>
     <w:p/>
@@ -2851,6 +2800,12 @@
 </file>
 
 <file path=customXml/item1.xml><?xml version="1.0" encoding="utf-8"?>
+<p:properties xmlns:p="http://schemas.microsoft.com/office/2006/metadata/properties" xmlns:xsi="http://www.w3.org/2001/XMLSchema-instance" xmlns:pc="http://schemas.microsoft.com/office/infopath/2007/PartnerControls">
+  <documentManagement/>
+</p:properties>
+</file>
+
+<file path=customXml/item2.xml><?xml version="1.0" encoding="utf-8"?>
 <ct:contentTypeSchema xmlns:ct="http://schemas.microsoft.com/office/2006/metadata/contentType" xmlns:ma="http://schemas.microsoft.com/office/2006/metadata/properties/metaAttributes" ct:_="" ma:_="" ma:contentTypeName="Documento" ma:contentTypeID="0x010100B37008164333CE47B7554A23BF4CE40A" ma:contentTypeVersion="0" ma:contentTypeDescription="Crie um novo documento." ma:contentTypeScope="" ma:versionID="1ac3350bdf74d0e717bf911788fb6e9e">
   <xsd:schema xmlns:xsd="http://www.w3.org/2001/XMLSchema" xmlns:xs="http://www.w3.org/2001/XMLSchema" xmlns:p="http://schemas.microsoft.com/office/2006/metadata/properties" targetNamespace="http://schemas.microsoft.com/office/2006/metadata/properties" ma:root="true" ma:fieldsID="e257547f92819c86ae4143fe76bb6c5b">
     <xsd:element name="properties">
@@ -2964,12 +2919,6 @@
 </ct:contentTypeSchema>
 </file>
 
-<file path=customXml/item2.xml><?xml version="1.0" encoding="utf-8"?>
-<p:properties xmlns:p="http://schemas.microsoft.com/office/2006/metadata/properties" xmlns:xsi="http://www.w3.org/2001/XMLSchema-instance" xmlns:pc="http://schemas.microsoft.com/office/infopath/2007/PartnerControls">
-  <documentManagement/>
-</p:properties>
-</file>
-
 <file path=customXml/item3.xml><?xml version="1.0" encoding="utf-8"?>
 <?mso-contentType ?>
 <FormTemplates xmlns="http://schemas.microsoft.com/sharepoint/v3/contenttype/forms">
@@ -2980,6 +2929,15 @@
 </file>
 
 <file path=customXml/itemProps1.xml><?xml version="1.0" encoding="utf-8"?>
+<ds:datastoreItem xmlns:ds="http://schemas.openxmlformats.org/officeDocument/2006/customXml" ds:itemID="{0028EFB7-3706-477C-BC22-76AF0C752638}">
+  <ds:schemaRefs>
+    <ds:schemaRef ds:uri="http://schemas.microsoft.com/office/2006/metadata/properties"/>
+    <ds:schemaRef ds:uri="http://schemas.microsoft.com/office/infopath/2007/PartnerControls"/>
+  </ds:schemaRefs>
+</ds:datastoreItem>
+</file>
+
+<file path=customXml/itemProps2.xml><?xml version="1.0" encoding="utf-8"?>
 <ds:datastoreItem xmlns:ds="http://schemas.openxmlformats.org/officeDocument/2006/customXml" ds:itemID="{EA1501F1-8D64-4161-ACF2-581550DAF0E9}">
   <ds:schemaRefs>
     <ds:schemaRef ds:uri="http://schemas.microsoft.com/office/2006/metadata/contentType"/>
@@ -2995,15 +2953,6 @@
 </ds:datastoreItem>
 </file>
 
-<file path=customXml/itemProps2.xml><?xml version="1.0" encoding="utf-8"?>
-<ds:datastoreItem xmlns:ds="http://schemas.openxmlformats.org/officeDocument/2006/customXml" ds:itemID="{0028EFB7-3706-477C-BC22-76AF0C752638}">
-  <ds:schemaRefs>
-    <ds:schemaRef ds:uri="http://schemas.microsoft.com/office/2006/metadata/properties"/>
-    <ds:schemaRef ds:uri="http://schemas.microsoft.com/office/infopath/2007/PartnerControls"/>
-  </ds:schemaRefs>
-</ds:datastoreItem>
-</file>
-
 <file path=customXml/itemProps3.xml><?xml version="1.0" encoding="utf-8"?>
 <ds:datastoreItem xmlns:ds="http://schemas.openxmlformats.org/officeDocument/2006/customXml" ds:itemID="{0876BD9A-9CA5-48C2-BF8E-F2DECFB0FD38}">
   <ds:schemaRefs>

</xml_diff>